<commit_message>
Collisions and explosions: three collision types (elastic, inelastic, explosion), buttons for how B moves before the collision, the momentum equations with numbers, real-speed contact; new title and updated worksheet
</commit_message>
<xml_diff>
--- a/18-collisions-explosions/worksheet.docx
+++ b/18-collisions-explosions/worksheet.docx
@@ -36,7 +36,7 @@
           <w:color w:val="606060"/>
           <w:sz w:val="24"/>
         </w:rPr>
-        <w:t xml:space="preserve"> · conservation of momentum (Block 7): elastic, inelastic, stick together, explosions and recoil</w:t>
+        <w:t xml:space="preserve"> · conservation of momentum (Block 7): elastic and inelastic collisions, explosions and recoil</w:t>
       </w:r>
     </w:p>
     <w:p>
@@ -173,26 +173,13 @@
                 <w:b/>
                 <w:sz w:val="21"/>
               </w:rPr>
-              <w:t>Stick together</w:t>
-            </w:r>
-            <w:r>
-              <w:rPr>
-                <w:sz w:val="21"/>
-              </w:rPr>
-              <w:t xml:space="preserve"> · </w:t>
-            </w:r>
-            <w:r>
-              <w:rPr>
-                <w:b/>
-                <w:sz w:val="21"/>
-              </w:rPr>
               <w:t>Explosion</w:t>
             </w:r>
             <w:r>
               <w:rPr>
                 <w:sz w:val="21"/>
               </w:rPr>
-              <w:t xml:space="preserve">. Pick an </w:t>
+              <w:t xml:space="preserve"> (changing the type keeps the masses and velocities). Pick an </w:t>
             </w:r>
             <w:r>
               <w:rPr>
@@ -268,7 +255,7 @@
               <w:rPr>
                 <w:sz w:val="21"/>
               </w:rPr>
-              <w:t xml:space="preserve"> for A, B and the total, and the kinetic energy before and after. The contact plays in slow motion; ◂ / ▸ step through it.</w:t>
+              <w:t xml:space="preserve"> for A, B and the total, and the kinetic energy before and after. The contact lasts only 0.1–0.2 s, like a real collision; ◂ / ▸ step through it.</w:t>
             </w:r>
           </w:p>
           <w:p>
@@ -840,7 +827,7 @@
               <w:rPr>
                 <w:sz w:val="19"/>
               </w:rPr>
-              <w:t>5. (A.3 link) Same carts and speeds: which type loses the most kinetic energy — elastic, inelastic or stick together?</w:t>
+              <w:t>5. (A.3 link) Same carts and speeds: which type loses more kinetic energy — elastic or inelastic (they stick together)?</w:t>
             </w:r>
           </w:p>
         </w:tc>
@@ -2159,19 +2146,7 @@
         <w:rPr>
           <w:b/>
         </w:rPr>
-        <w:t xml:space="preserve"> = +0.32 m s⁻¹, not −0.167 and +0.333 m s⁻¹. Set </w:t>
-      </w:r>
-      <w:r>
-        <w:rPr>
-          <w:b/>
-        </w:rPr>
-        <w:t>Inelastic</w:t>
-      </w:r>
-      <w:r>
-        <w:rPr>
-          <w:b/>
-        </w:rPr>
-        <w:t xml:space="preserve"> with bounciness 0.94: what does this tell you about real magnetic bumpers? Give one other reason why real data differ from the model.</w:t>
+        <w:t xml:space="preserve"> = +0.32 m s⁻¹, not −0.167 and +0.333 m s⁻¹ as in the simulation (an ideal elastic collision). (A.3 link) Calculate the percentage of the kinetic energy the real carts lost. What does this tell you about real magnetic bumpers? Give one other reason why real data differ from the model.</w:t>
       </w:r>
     </w:p>
     <w:p>
@@ -2489,7 +2464,7 @@
         <w:rPr>
           <w:b/>
         </w:rPr>
-        <w:t>14. A 1.0 kg cart at 2.0 m s⁻¹ hits a 3.0 kg cart at rest and bounces back at 0.50 m s⁻¹. Calculate the velocity of the 3.0 kg cart. (A.3 link) What percentage of the kinetic energy is lost? What type of collision is this?</w:t>
+        <w:t>14. A 1.0 kg cart at 2.0 m s⁻¹ hits a 3.0 kg cart at rest and bounces back at 1.0 m s⁻¹. Calculate the velocity of the 3.0 kg cart. (A.3 link) Calculate the total kinetic energy before and after the collision. What type of collision is this? Explain.</w:t>
       </w:r>
     </w:p>
     <w:tbl>

</xml_diff>